<commit_message>
Document repository and single-seed generation
Add the private code URL to research materials and describe the verified
Git Bash workflow for generating or resuming one seeded world.
</commit_message>
<xml_diff>
--- a/research/docs/多模态电网潮流计算_项目描述与调研框架.docx
+++ b/research/docs/多模态电网潮流计算_项目描述与调研框架.docx
@@ -1001,6 +1001,56 @@
                 <w:sz w:val="16"/>
               </w:rPr>
               <w:t>形成时序运行标签和调节结果</w:t>
+            </w:r>
+          </w:p>
+        </w:tc>
+      </w:tr>
+    </w:tbl>
+    <w:p>
+      <w:pPr>
+        <w:spacing w:after="20"/>
+      </w:pPr>
+    </w:p>
+    <w:tbl>
+      <w:tblPr>
+        <w:tblW w:type="auto" w:w="0"/>
+        <w:jc w:val="center"/>
+        <w:tblLook w:firstColumn="1" w:firstRow="1" w:lastColumn="0" w:lastRow="0" w:noHBand="0" w:noVBand="1" w:val="04A0"/>
+      </w:tblPr>
+      <w:tblGrid>
+        <w:gridCol w:w="9354"/>
+      </w:tblGrid>
+      <w:tr>
+        <w:tc>
+          <w:tcPr>
+            <w:tcW w:type="dxa" w:w="9354"/>
+            <w:shd w:fill="E8F5F4"/>
+            <w:tcMar>
+              <w:top w:w="130" w:type="dxa"/>
+              <w:start w:w="160" w:type="dxa"/>
+              <w:bottom w:w="130" w:type="dxa"/>
+              <w:end w:w="160" w:type="dxa"/>
+            </w:tcMar>
+          </w:tcPr>
+          <w:p>
+            <w:r>
+              <w:rPr>
+                <w:rFonts w:ascii="Calibri" w:hAnsi="Calibri" w:eastAsia="Microsoft YaHei"/>
+                <w:b/>
+                <w:color w:val="2A9D8F"/>
+                <w:sz w:val="21"/>
+              </w:rPr>
+              <w:t>代码仓库</w:t>
+              <w:br/>
+            </w:r>
+            <w:r>
+              <w:rPr>
+                <w:rFonts w:ascii="Calibri" w:hAnsi="Calibri" w:eastAsia="Microsoft YaHei"/>
+                <w:b w:val="0"/>
+                <w:color w:val="20252B"/>
+                <w:sz w:val="20"/>
+              </w:rPr>
+              <w:t>项目代码与研究材料同步维护于：https://github.com/Hevensh/SimGenr（私人仓库）。</w:t>
             </w:r>
           </w:p>
         </w:tc>

</xml_diff>